<commit_message>
1. modify datases.xlsx to remove some useless index. 2. modify sql generate logic. 3. modify design documents.
</commit_message>
<xml_diff>
--- a/documents/详细设计书.docx
+++ b/documents/详细设计书.docx
@@ -53,6 +53,11 @@
       </w:r>
     </w:p>
     <w:p>
+      <w:pPr>
+        <w:rPr>
+          <w:rFonts w:hint="eastAsia"/>
+        </w:rPr>
+      </w:pPr>
       <w:r>
         <w:rPr>
           <w:rFonts w:hint="eastAsia"/>
@@ -182,11 +187,522 @@
           <w:color w:val="auto"/>
           <w:sz w:val="44"/>
         </w:rPr>
-        <w:t>系统总体设计</w:t>
+        <w:t>准则</w:t>
       </w:r>
     </w:p>
     <w:p/>
     <w:p/>
+    <w:p>
+      <w:pPr>
+        <w:rPr>
+          <w:rFonts w:hint="eastAsia"/>
+        </w:rPr>
+      </w:pPr>
+      <w:r>
+        <w:rPr>
+          <w:rFonts w:hint="eastAsia"/>
+        </w:rPr>
+        <w:t>数据表对应的后端model设计准则：</w:t>
+      </w:r>
+    </w:p>
+    <w:p>
+      <w:pPr>
+        <w:pStyle w:val="a9"/>
+        <w:numPr>
+          <w:ilvl w:val="0"/>
+          <w:numId w:val="3"/>
+        </w:numPr>
+      </w:pPr>
+      <w:r>
+        <w:rPr>
+          <w:rFonts w:hint="eastAsia"/>
+        </w:rPr>
+        <w:t>ID必须要写</w:t>
+      </w:r>
+      <w:r>
+        <w:t>gorm:"</w:t>
+      </w:r>
+      <w:proofErr w:type="spellStart"/>
+      <w:r>
+        <w:t>type:uuid;primaryKey;default:gen_random_uuid</w:t>
+      </w:r>
+      <w:proofErr w:type="spellEnd"/>
+      <w:r>
+        <w:t>()"</w:t>
+      </w:r>
+    </w:p>
+    <w:p>
+      <w:pPr>
+        <w:pStyle w:val="a9"/>
+        <w:numPr>
+          <w:ilvl w:val="0"/>
+          <w:numId w:val="3"/>
+        </w:numPr>
+      </w:pPr>
+      <w:r>
+        <w:rPr>
+          <w:rFonts w:hint="eastAsia"/>
+        </w:rPr>
+        <w:t>可以为空的值一定要设计为指针。</w:t>
+      </w:r>
+    </w:p>
+    <w:p>
+      <w:pPr>
+        <w:pStyle w:val="a9"/>
+        <w:numPr>
+          <w:ilvl w:val="0"/>
+          <w:numId w:val="3"/>
+        </w:numPr>
+      </w:pPr>
+      <w:r>
+        <w:rPr>
+          <w:rFonts w:hint="eastAsia"/>
+        </w:rPr>
+        <w:t>其它的只有设置了默认值的列需要写</w:t>
+      </w:r>
+      <w:r>
+        <w:t>gorm:"</w:t>
+      </w:r>
+      <w:proofErr w:type="spellStart"/>
+      <w:r>
+        <w:t>default:user</w:t>
+      </w:r>
+      <w:proofErr w:type="spellEnd"/>
+      <w:r>
+        <w:t>;"</w:t>
+      </w:r>
+      <w:r>
+        <w:rPr>
+          <w:rFonts w:hint="eastAsia"/>
+        </w:rPr>
+        <w:t>，否则go会给0值到数据库，但如果默认值是NULL那就不要写，因为go默认会给NULL。</w:t>
+      </w:r>
+    </w:p>
+    <w:p>
+      <w:pPr>
+        <w:rPr>
+          <w:rFonts w:hint="eastAsia"/>
+        </w:rPr>
+      </w:pPr>
+    </w:p>
+    <w:p>
+      <w:pPr>
+        <w:rPr>
+          <w:rFonts w:hint="eastAsia"/>
+        </w:rPr>
+      </w:pPr>
+    </w:p>
+    <w:p/>
+    <w:p>
+      <w:r>
+        <w:rPr>
+          <w:rFonts w:hint="eastAsia"/>
+        </w:rPr>
+        <w:t>数据通信model设计</w:t>
+      </w:r>
+      <w:r>
+        <w:rPr>
+          <w:rFonts w:hint="eastAsia"/>
+        </w:rPr>
+        <w:t>准则</w:t>
+      </w:r>
+      <w:r>
+        <w:rPr>
+          <w:rFonts w:hint="eastAsia"/>
+        </w:rPr>
+        <w:t>，类似如下：</w:t>
+      </w:r>
+      <w:r>
+        <w:rPr>
+          <w:rFonts w:hint="eastAsia"/>
+        </w:rPr>
+        <w:t>（最终版）</w:t>
+      </w:r>
+    </w:p>
+    <w:p/>
+    <w:p>
+      <w:r>
+        <w:t>DB Model</w:t>
+      </w:r>
+      <w:r>
+        <w:rPr>
+          <w:rFonts w:hint="eastAsia"/>
+        </w:rPr>
+        <w:t xml:space="preserve">   </w:t>
+      </w:r>
+      <w:r>
+        <w:t>DTO (request)</w:t>
+      </w:r>
+      <w:r>
+        <w:rPr>
+          <w:rFonts w:hint="eastAsia"/>
+        </w:rPr>
+        <w:t xml:space="preserve">   </w:t>
+      </w:r>
+      <w:r>
+        <w:t>Response (API)</w:t>
+      </w:r>
+    </w:p>
+    <w:p/>
+    <w:p>
+      <w:pPr>
+        <w:rPr>
+          <w:b/>
+          <w:bCs/>
+        </w:rPr>
+      </w:pPr>
+      <w:r>
+        <w:rPr>
+          <w:b/>
+          <w:bCs/>
+        </w:rPr>
+        <w:t>数据库模型（internal/model）</w:t>
+      </w:r>
+    </w:p>
+    <w:p>
+      <w:r>
+        <w:t>type User struct {</w:t>
+      </w:r>
+    </w:p>
+    <w:p>
+      <w:r>
+        <w:t xml:space="preserve">    ID                </w:t>
+      </w:r>
+      <w:proofErr w:type="spellStart"/>
+      <w:r>
+        <w:t>uuid.UUID</w:t>
+      </w:r>
+      <w:proofErr w:type="spellEnd"/>
+    </w:p>
+    <w:p>
+      <w:r>
+        <w:t xml:space="preserve">    Email             string</w:t>
+      </w:r>
+    </w:p>
+    <w:p>
+      <w:r>
+        <w:t xml:space="preserve">    </w:t>
+      </w:r>
+      <w:proofErr w:type="spellStart"/>
+      <w:r>
+        <w:t>PasswordHash</w:t>
+      </w:r>
+      <w:proofErr w:type="spellEnd"/>
+      <w:r>
+        <w:t xml:space="preserve">      string</w:t>
+      </w:r>
+    </w:p>
+    <w:p>
+      <w:r>
+        <w:t xml:space="preserve">    </w:t>
+      </w:r>
+      <w:proofErr w:type="spellStart"/>
+      <w:r>
+        <w:t>PreferredCurrency</w:t>
+      </w:r>
+      <w:proofErr w:type="spellEnd"/>
+      <w:r>
+        <w:t xml:space="preserve"> string</w:t>
+      </w:r>
+    </w:p>
+    <w:p>
+      <w:r>
+        <w:t xml:space="preserve">    </w:t>
+      </w:r>
+      <w:proofErr w:type="spellStart"/>
+      <w:r>
+        <w:t>CreatedAt</w:t>
+      </w:r>
+      <w:proofErr w:type="spellEnd"/>
+      <w:r>
+        <w:t xml:space="preserve">         </w:t>
+      </w:r>
+      <w:proofErr w:type="spellStart"/>
+      <w:r>
+        <w:t>time.Time</w:t>
+      </w:r>
+      <w:proofErr w:type="spellEnd"/>
+    </w:p>
+    <w:p>
+      <w:r>
+        <w:t>}</w:t>
+      </w:r>
+    </w:p>
+    <w:p>
+      <w:r>
+        <w:t xml:space="preserve">不写 </w:t>
+      </w:r>
+      <w:proofErr w:type="spellStart"/>
+      <w:r>
+        <w:t>json</w:t>
+      </w:r>
+      <w:proofErr w:type="spellEnd"/>
+      <w:r>
+        <w:t xml:space="preserve"> tag 也可以。</w:t>
+      </w:r>
+    </w:p>
+    <w:p/>
+    <w:p>
+      <w:pPr>
+        <w:rPr>
+          <w:b/>
+          <w:bCs/>
+        </w:rPr>
+      </w:pPr>
+      <w:r>
+        <w:rPr>
+          <w:b/>
+          <w:bCs/>
+        </w:rPr>
+        <w:t>注册请求 DTO</w:t>
+      </w:r>
+    </w:p>
+    <w:p>
+      <w:r>
+        <w:t xml:space="preserve">type </w:t>
+      </w:r>
+      <w:proofErr w:type="spellStart"/>
+      <w:r>
+        <w:t>RegisterRequest</w:t>
+      </w:r>
+      <w:proofErr w:type="spellEnd"/>
+      <w:r>
+        <w:t xml:space="preserve"> struct {</w:t>
+      </w:r>
+    </w:p>
+    <w:p>
+      <w:r>
+        <w:t xml:space="preserve">    Email    string `</w:t>
+      </w:r>
+      <w:proofErr w:type="spellStart"/>
+      <w:r>
+        <w:t>json</w:t>
+      </w:r>
+      <w:proofErr w:type="spellEnd"/>
+      <w:r>
+        <w:t>:"email"`</w:t>
+      </w:r>
+    </w:p>
+    <w:p>
+      <w:r>
+        <w:t xml:space="preserve">    Password string `</w:t>
+      </w:r>
+      <w:proofErr w:type="spellStart"/>
+      <w:r>
+        <w:t>json</w:t>
+      </w:r>
+      <w:proofErr w:type="spellEnd"/>
+      <w:r>
+        <w:t>:"password"`</w:t>
+      </w:r>
+    </w:p>
+    <w:p>
+      <w:r>
+        <w:lastRenderedPageBreak/>
+        <w:t xml:space="preserve">    Name     string `</w:t>
+      </w:r>
+      <w:proofErr w:type="spellStart"/>
+      <w:r>
+        <w:t>json</w:t>
+      </w:r>
+      <w:proofErr w:type="spellEnd"/>
+      <w:r>
+        <w:t>:"name"`</w:t>
+      </w:r>
+    </w:p>
+    <w:p>
+      <w:r>
+        <w:t>}</w:t>
+      </w:r>
+    </w:p>
+    <w:p/>
+    <w:p>
+      <w:pPr>
+        <w:rPr>
+          <w:b/>
+          <w:bCs/>
+        </w:rPr>
+      </w:pPr>
+      <w:r>
+        <w:rPr>
+          <w:b/>
+          <w:bCs/>
+        </w:rPr>
+        <w:t>API 返回对象</w:t>
+      </w:r>
+    </w:p>
+    <w:p>
+      <w:r>
+        <w:t xml:space="preserve">type </w:t>
+      </w:r>
+      <w:proofErr w:type="spellStart"/>
+      <w:r>
+        <w:t>UserResponse</w:t>
+      </w:r>
+      <w:proofErr w:type="spellEnd"/>
+      <w:r>
+        <w:t xml:space="preserve"> struct {</w:t>
+      </w:r>
+    </w:p>
+    <w:p>
+      <w:r>
+        <w:t xml:space="preserve">    ID                </w:t>
+      </w:r>
+      <w:proofErr w:type="spellStart"/>
+      <w:r>
+        <w:t>uuid.UUID</w:t>
+      </w:r>
+      <w:proofErr w:type="spellEnd"/>
+      <w:r>
+        <w:t xml:space="preserve"> `</w:t>
+      </w:r>
+      <w:proofErr w:type="spellStart"/>
+      <w:r>
+        <w:t>json</w:t>
+      </w:r>
+      <w:proofErr w:type="spellEnd"/>
+      <w:r>
+        <w:t>:"id"`</w:t>
+      </w:r>
+    </w:p>
+    <w:p>
+      <w:r>
+        <w:t xml:space="preserve">    Email             string    `</w:t>
+      </w:r>
+      <w:proofErr w:type="spellStart"/>
+      <w:r>
+        <w:t>json</w:t>
+      </w:r>
+      <w:proofErr w:type="spellEnd"/>
+      <w:r>
+        <w:t>:"email"`</w:t>
+      </w:r>
+    </w:p>
+    <w:p>
+      <w:r>
+        <w:t xml:space="preserve">    Name              string    `</w:t>
+      </w:r>
+      <w:proofErr w:type="spellStart"/>
+      <w:r>
+        <w:t>json</w:t>
+      </w:r>
+      <w:proofErr w:type="spellEnd"/>
+      <w:r>
+        <w:t>:"name"`</w:t>
+      </w:r>
+    </w:p>
+    <w:p>
+      <w:r>
+        <w:t xml:space="preserve">    </w:t>
+      </w:r>
+      <w:proofErr w:type="spellStart"/>
+      <w:r>
+        <w:t>PreferredCurrency</w:t>
+      </w:r>
+      <w:proofErr w:type="spellEnd"/>
+      <w:r>
+        <w:t xml:space="preserve"> string    `</w:t>
+      </w:r>
+      <w:proofErr w:type="spellStart"/>
+      <w:r>
+        <w:t>json</w:t>
+      </w:r>
+      <w:proofErr w:type="spellEnd"/>
+      <w:r>
+        <w:t>:"</w:t>
+      </w:r>
+      <w:proofErr w:type="spellStart"/>
+      <w:r>
+        <w:t>preferred_currency</w:t>
+      </w:r>
+      <w:proofErr w:type="spellEnd"/>
+      <w:r>
+        <w:t>"`</w:t>
+      </w:r>
+    </w:p>
+    <w:p>
+      <w:r>
+        <w:t xml:space="preserve">    </w:t>
+      </w:r>
+      <w:proofErr w:type="spellStart"/>
+      <w:r>
+        <w:t>CreatedAt</w:t>
+      </w:r>
+      <w:proofErr w:type="spellEnd"/>
+      <w:r>
+        <w:t xml:space="preserve">         </w:t>
+      </w:r>
+      <w:proofErr w:type="spellStart"/>
+      <w:r>
+        <w:t>time.Time</w:t>
+      </w:r>
+      <w:proofErr w:type="spellEnd"/>
+      <w:r>
+        <w:t xml:space="preserve"> `</w:t>
+      </w:r>
+      <w:proofErr w:type="spellStart"/>
+      <w:r>
+        <w:t>json</w:t>
+      </w:r>
+      <w:proofErr w:type="spellEnd"/>
+      <w:r>
+        <w:t>:"</w:t>
+      </w:r>
+      <w:proofErr w:type="spellStart"/>
+      <w:r>
+        <w:t>created_at</w:t>
+      </w:r>
+      <w:proofErr w:type="spellEnd"/>
+      <w:r>
+        <w:t>"`</w:t>
+      </w:r>
+    </w:p>
+    <w:p>
+      <w:r>
+        <w:t>}</w:t>
+      </w:r>
+    </w:p>
+    <w:p>
+      <w:pPr>
+        <w:rPr>
+          <w:rFonts w:hint="eastAsia"/>
+        </w:rPr>
+      </w:pPr>
+    </w:p>
+    <w:p>
+      <w:pPr>
+        <w:pStyle w:val="1"/>
+        <w:numPr>
+          <w:ilvl w:val="0"/>
+          <w:numId w:val="1"/>
+        </w:numPr>
+        <w:rPr>
+          <w:rFonts w:hint="eastAsia"/>
+          <w:b/>
+          <w:color w:val="auto"/>
+          <w:sz w:val="44"/>
+        </w:rPr>
+      </w:pPr>
+      <w:r>
+        <w:rPr>
+          <w:rFonts w:hint="eastAsia"/>
+          <w:b/>
+          <w:color w:val="auto"/>
+          <w:sz w:val="44"/>
+        </w:rPr>
+        <w:t>模块功能定义</w:t>
+      </w:r>
+    </w:p>
+    <w:p/>
+    <w:p/>
+    <w:p/>
+    <w:p>
+      <w:pPr>
+        <w:rPr>
+          <w:rFonts w:hint="eastAsia"/>
+        </w:rPr>
+      </w:pPr>
+    </w:p>
     <w:p>
       <w:pPr>
         <w:rPr>
@@ -498,11 +1014,127 @@
       </w:rPr>
     </w:lvl>
   </w:abstractNum>
+  <w:abstractNum w:abstractNumId="2" w15:restartNumberingAfterBreak="0">
+    <w:nsid w:val="76FE4D7D"/>
+    <w:multiLevelType w:val="hybridMultilevel"/>
+    <w:tmpl w:val="EC9A827C"/>
+    <w:lvl w:ilvl="0" w:tplc="04090001">
+      <w:start w:val="1"/>
+      <w:numFmt w:val="bullet"/>
+      <w:lvlText w:val=""/>
+      <w:lvlJc w:val="left"/>
+      <w:pPr>
+        <w:ind w:left="440" w:hanging="440"/>
+      </w:pPr>
+      <w:rPr>
+        <w:rFonts w:ascii="Wingdings" w:hAnsi="Wingdings" w:hint="default"/>
+      </w:rPr>
+    </w:lvl>
+    <w:lvl w:ilvl="1" w:tplc="04090003" w:tentative="1">
+      <w:start w:val="1"/>
+      <w:numFmt w:val="bullet"/>
+      <w:lvlText w:val=""/>
+      <w:lvlJc w:val="left"/>
+      <w:pPr>
+        <w:ind w:left="880" w:hanging="440"/>
+      </w:pPr>
+      <w:rPr>
+        <w:rFonts w:ascii="Wingdings" w:hAnsi="Wingdings" w:hint="default"/>
+      </w:rPr>
+    </w:lvl>
+    <w:lvl w:ilvl="2" w:tplc="04090005" w:tentative="1">
+      <w:start w:val="1"/>
+      <w:numFmt w:val="bullet"/>
+      <w:lvlText w:val=""/>
+      <w:lvlJc w:val="left"/>
+      <w:pPr>
+        <w:ind w:left="1320" w:hanging="440"/>
+      </w:pPr>
+      <w:rPr>
+        <w:rFonts w:ascii="Wingdings" w:hAnsi="Wingdings" w:hint="default"/>
+      </w:rPr>
+    </w:lvl>
+    <w:lvl w:ilvl="3" w:tplc="04090001" w:tentative="1">
+      <w:start w:val="1"/>
+      <w:numFmt w:val="bullet"/>
+      <w:lvlText w:val=""/>
+      <w:lvlJc w:val="left"/>
+      <w:pPr>
+        <w:ind w:left="1760" w:hanging="440"/>
+      </w:pPr>
+      <w:rPr>
+        <w:rFonts w:ascii="Wingdings" w:hAnsi="Wingdings" w:hint="default"/>
+      </w:rPr>
+    </w:lvl>
+    <w:lvl w:ilvl="4" w:tplc="04090003" w:tentative="1">
+      <w:start w:val="1"/>
+      <w:numFmt w:val="bullet"/>
+      <w:lvlText w:val=""/>
+      <w:lvlJc w:val="left"/>
+      <w:pPr>
+        <w:ind w:left="2200" w:hanging="440"/>
+      </w:pPr>
+      <w:rPr>
+        <w:rFonts w:ascii="Wingdings" w:hAnsi="Wingdings" w:hint="default"/>
+      </w:rPr>
+    </w:lvl>
+    <w:lvl w:ilvl="5" w:tplc="04090005" w:tentative="1">
+      <w:start w:val="1"/>
+      <w:numFmt w:val="bullet"/>
+      <w:lvlText w:val=""/>
+      <w:lvlJc w:val="left"/>
+      <w:pPr>
+        <w:ind w:left="2640" w:hanging="440"/>
+      </w:pPr>
+      <w:rPr>
+        <w:rFonts w:ascii="Wingdings" w:hAnsi="Wingdings" w:hint="default"/>
+      </w:rPr>
+    </w:lvl>
+    <w:lvl w:ilvl="6" w:tplc="04090001" w:tentative="1">
+      <w:start w:val="1"/>
+      <w:numFmt w:val="bullet"/>
+      <w:lvlText w:val=""/>
+      <w:lvlJc w:val="left"/>
+      <w:pPr>
+        <w:ind w:left="3080" w:hanging="440"/>
+      </w:pPr>
+      <w:rPr>
+        <w:rFonts w:ascii="Wingdings" w:hAnsi="Wingdings" w:hint="default"/>
+      </w:rPr>
+    </w:lvl>
+    <w:lvl w:ilvl="7" w:tplc="04090003" w:tentative="1">
+      <w:start w:val="1"/>
+      <w:numFmt w:val="bullet"/>
+      <w:lvlText w:val=""/>
+      <w:lvlJc w:val="left"/>
+      <w:pPr>
+        <w:ind w:left="3520" w:hanging="440"/>
+      </w:pPr>
+      <w:rPr>
+        <w:rFonts w:ascii="Wingdings" w:hAnsi="Wingdings" w:hint="default"/>
+      </w:rPr>
+    </w:lvl>
+    <w:lvl w:ilvl="8" w:tplc="04090005" w:tentative="1">
+      <w:start w:val="1"/>
+      <w:numFmt w:val="bullet"/>
+      <w:lvlText w:val=""/>
+      <w:lvlJc w:val="left"/>
+      <w:pPr>
+        <w:ind w:left="3960" w:hanging="440"/>
+      </w:pPr>
+      <w:rPr>
+        <w:rFonts w:ascii="Wingdings" w:hAnsi="Wingdings" w:hint="default"/>
+      </w:rPr>
+    </w:lvl>
+  </w:abstractNum>
   <w:num w:numId="1" w16cid:durableId="733162899">
     <w:abstractNumId w:val="1"/>
   </w:num>
   <w:num w:numId="2" w16cid:durableId="834297792">
     <w:abstractNumId w:val="0"/>
+  </w:num>
+  <w:num w:numId="3" w16cid:durableId="1502157214">
+    <w:abstractNumId w:val="2"/>
   </w:num>
 </w:numbering>
 </file>
@@ -1110,7 +1742,6 @@
   <w:style w:type="character" w:default="1" w:styleId="a0">
     <w:name w:val="Default Paragraph Font"/>
     <w:uiPriority w:val="1"/>
-    <w:semiHidden/>
     <w:unhideWhenUsed/>
   </w:style>
   <w:style w:type="table" w:default="1" w:styleId="a1">

</xml_diff>

<commit_message>
1. Finished all models and repositories. 2. Changed exchange_rates.date to exchange_rates.rate_date. Add Composite Unique for exchange_rates table. 3. Changed some file names.
But not all tested.
</commit_message>
<xml_diff>
--- a/documents/详细设计书.docx
+++ b/documents/详细设计书.docx
@@ -190,20 +190,12 @@
         <w:t>准则</w:t>
       </w:r>
     </w:p>
-    <w:p/>
-    <w:p/>
-    <w:p>
-      <w:pPr>
-        <w:rPr>
-          <w:rFonts w:hint="eastAsia"/>
-        </w:rPr>
-      </w:pPr>
-      <w:r>
-        <w:rPr>
-          <w:rFonts w:hint="eastAsia"/>
-        </w:rPr>
-        <w:t>数据表对应的后端model设计准则：</w:t>
-      </w:r>
+    <w:p>
+      <w:pPr>
+        <w:rPr>
+          <w:rFonts w:hint="eastAsia"/>
+        </w:rPr>
+      </w:pPr>
     </w:p>
     <w:p>
       <w:pPr>
@@ -212,24 +204,215 @@
           <w:ilvl w:val="0"/>
           <w:numId w:val="3"/>
         </w:numPr>
-      </w:pPr>
-      <w:r>
-        <w:rPr>
-          <w:rFonts w:hint="eastAsia"/>
-        </w:rPr>
-        <w:t>ID必须要写</w:t>
-      </w:r>
-      <w:r>
-        <w:t>gorm:"</w:t>
-      </w:r>
-      <w:proofErr w:type="spellStart"/>
-      <w:r>
-        <w:t>type:uuid;primaryKey;default:gen_random_uuid</w:t>
-      </w:r>
-      <w:proofErr w:type="spellEnd"/>
-      <w:r>
-        <w:t>()"</w:t>
-      </w:r>
+        <w:rPr>
+          <w:rFonts w:hint="eastAsia"/>
+        </w:rPr>
+      </w:pPr>
+      <w:r>
+        <w:rPr>
+          <w:b/>
+          <w:bCs/>
+        </w:rPr>
+        <w:t>DB-first GORM 使用规范</w:t>
+      </w:r>
+    </w:p>
+    <w:p>
+      <w:pPr>
+        <w:pStyle w:val="a9"/>
+        <w:numPr>
+          <w:ilvl w:val="1"/>
+          <w:numId w:val="3"/>
+        </w:numPr>
+        <w:rPr>
+          <w:rFonts w:hint="eastAsia"/>
+        </w:rPr>
+      </w:pPr>
+      <w:r>
+        <w:t>只写 gorm tag 在以下情况：</w:t>
+      </w:r>
+    </w:p>
+    <w:p>
+      <w:pPr>
+        <w:ind w:leftChars="500" w:left="1050"/>
+        <w:rPr>
+          <w:rFonts w:hint="eastAsia"/>
+          <w:b/>
+          <w:bCs/>
+        </w:rPr>
+      </w:pPr>
+      <w:r>
+        <w:rPr>
+          <w:b/>
+          <w:bCs/>
+        </w:rPr>
+        <w:t>1. DB 默认值字段</w:t>
+      </w:r>
+    </w:p>
+    <w:p>
+      <w:pPr>
+        <w:numPr>
+          <w:ilvl w:val="0"/>
+          <w:numId w:val="4"/>
+        </w:numPr>
+        <w:tabs>
+          <w:tab w:val="clear" w:pos="720"/>
+          <w:tab w:val="num" w:pos="1769"/>
+        </w:tabs>
+        <w:ind w:leftChars="670" w:left="1767"/>
+        <w:rPr>
+          <w:rFonts w:hint="eastAsia"/>
+        </w:rPr>
+      </w:pPr>
+      <w:r>
+        <w:t>uuid</w:t>
+      </w:r>
+    </w:p>
+    <w:p>
+      <w:pPr>
+        <w:numPr>
+          <w:ilvl w:val="0"/>
+          <w:numId w:val="4"/>
+        </w:numPr>
+        <w:tabs>
+          <w:tab w:val="clear" w:pos="720"/>
+          <w:tab w:val="num" w:pos="1769"/>
+        </w:tabs>
+        <w:ind w:leftChars="670" w:left="1767"/>
+        <w:rPr>
+          <w:rFonts w:hint="eastAsia"/>
+        </w:rPr>
+      </w:pPr>
+      <w:r>
+        <w:t>now()</w:t>
+      </w:r>
+    </w:p>
+    <w:p>
+      <w:pPr>
+        <w:numPr>
+          <w:ilvl w:val="0"/>
+          <w:numId w:val="4"/>
+        </w:numPr>
+        <w:tabs>
+          <w:tab w:val="clear" w:pos="720"/>
+          <w:tab w:val="num" w:pos="1769"/>
+        </w:tabs>
+        <w:ind w:leftChars="670" w:left="1767"/>
+        <w:rPr>
+          <w:rFonts w:hint="eastAsia"/>
+        </w:rPr>
+      </w:pPr>
+      <w:r>
+        <w:rPr>
+          <w:rFonts w:hint="eastAsia"/>
+        </w:rPr>
+        <w:t>其它默认值</w:t>
+      </w:r>
+    </w:p>
+    <w:p>
+      <w:pPr>
+        <w:ind w:leftChars="500" w:left="1050"/>
+        <w:rPr>
+          <w:rFonts w:hint="eastAsia"/>
+          <w:b/>
+          <w:bCs/>
+        </w:rPr>
+      </w:pPr>
+      <w:r>
+        <w:rPr>
+          <w:b/>
+          <w:bCs/>
+        </w:rPr>
+        <w:t>2. 主键</w:t>
+      </w:r>
+    </w:p>
+    <w:p>
+      <w:pPr>
+        <w:ind w:leftChars="500" w:left="1050"/>
+        <w:rPr>
+          <w:rFonts w:hint="eastAsia"/>
+        </w:rPr>
+      </w:pPr>
+      <w:r>
+        <w:t>primaryKey</w:t>
+      </w:r>
+    </w:p>
+    <w:p>
+      <w:pPr>
+        <w:ind w:leftChars="400" w:left="840"/>
+      </w:pPr>
+      <w:r>
+        <w:t>其它一律不写。</w:t>
+      </w:r>
+    </w:p>
+    <w:p>
+      <w:pPr>
+        <w:rPr>
+          <w:rFonts w:hint="eastAsia"/>
+        </w:rPr>
+      </w:pPr>
+    </w:p>
+    <w:p>
+      <w:pPr>
+        <w:pStyle w:val="a9"/>
+        <w:numPr>
+          <w:ilvl w:val="1"/>
+          <w:numId w:val="3"/>
+        </w:numPr>
+      </w:pPr>
+      <w:r>
+        <w:rPr>
+          <w:rFonts w:hint="eastAsia"/>
+        </w:rPr>
+        <w:t>DB里可以为空的列</w:t>
+      </w:r>
+      <w:r>
+        <w:rPr>
+          <w:rFonts w:hint="eastAsia"/>
+        </w:rPr>
+        <w:t>要设计为指针。</w:t>
+      </w:r>
+    </w:p>
+    <w:p>
+      <w:pPr>
+        <w:pStyle w:val="a9"/>
+        <w:numPr>
+          <w:ilvl w:val="1"/>
+          <w:numId w:val="3"/>
+        </w:numPr>
+      </w:pPr>
+      <w:r>
+        <w:rPr>
+          <w:rFonts w:hint="eastAsia"/>
+        </w:rPr>
+        <w:t>deleted_at</w:t>
+      </w:r>
+      <w:r>
+        <w:rPr>
+          <w:rFonts w:hint="eastAsia"/>
+        </w:rPr>
+        <w:t>也交给DB处理，model里只要写</w:t>
+      </w:r>
+      <w:r>
+        <w:t>DeletedAt</w:t>
+      </w:r>
+      <w:r>
+        <w:rPr>
+          <w:rFonts w:hint="eastAsia"/>
+        </w:rPr>
+        <w:t xml:space="preserve"> </w:t>
+      </w:r>
+      <w:r>
+        <w:t>*time.Time `json:"deleted_at"`</w:t>
+      </w:r>
+    </w:p>
+    <w:p>
+      <w:pPr>
+        <w:pStyle w:val="a9"/>
+        <w:ind w:left="880"/>
+        <w:rPr>
+          <w:rFonts w:hint="eastAsia"/>
+        </w:rPr>
+      </w:pPr>
     </w:p>
     <w:p>
       <w:pPr>
@@ -243,7 +426,61 @@
         <w:rPr>
           <w:rFonts w:hint="eastAsia"/>
         </w:rPr>
-        <w:t>可以为空的值一定要设计为指针。</w:t>
+        <w:t>安全原则</w:t>
+      </w:r>
+    </w:p>
+    <w:p>
+      <w:pPr>
+        <w:pStyle w:val="a9"/>
+        <w:numPr>
+          <w:ilvl w:val="1"/>
+          <w:numId w:val="3"/>
+        </w:numPr>
+      </w:pPr>
+      <w:r>
+        <w:rPr>
+          <w:rFonts w:hint="eastAsia"/>
+        </w:rPr>
+        <w:t>任何用户都只能</w:t>
+      </w:r>
+      <w:r>
+        <w:rPr>
+          <w:rFonts w:hint="eastAsia"/>
+        </w:rPr>
+        <w:t>处理他有权限的数据</w:t>
+      </w:r>
+    </w:p>
+    <w:p>
+      <w:pPr>
+        <w:pStyle w:val="a9"/>
+        <w:numPr>
+          <w:ilvl w:val="1"/>
+          <w:numId w:val="3"/>
+        </w:numPr>
+      </w:pPr>
+      <w:r>
+        <w:rPr>
+          <w:rFonts w:hint="eastAsia"/>
+        </w:rPr>
+        <w:t>只信任</w:t>
+      </w:r>
+      <w:r>
+        <w:rPr>
+          <w:rFonts w:hint="eastAsia"/>
+        </w:rPr>
+        <w:t>并使用</w:t>
+      </w:r>
+      <w:r>
+        <w:rPr>
+          <w:rFonts w:hint="eastAsia"/>
+        </w:rPr>
+        <w:t>通过token解析出来的user_id</w:t>
+      </w:r>
+      <w:r>
+        <w:rPr>
+          <w:rFonts w:hint="eastAsia"/>
+        </w:rPr>
+        <w:t>，而不是使用http请求参数中的user_id。</w:t>
       </w:r>
     </w:p>
     <w:p>
@@ -258,42 +495,68 @@
         <w:rPr>
           <w:rFonts w:hint="eastAsia"/>
         </w:rPr>
-        <w:t>其它的只有设置了默认值的列需要写</w:t>
-      </w:r>
-      <w:r>
-        <w:t>gorm:"</w:t>
-      </w:r>
-      <w:proofErr w:type="spellStart"/>
-      <w:r>
-        <w:t>default:user</w:t>
-      </w:r>
-      <w:proofErr w:type="spellEnd"/>
-      <w:r>
-        <w:t>;"</w:t>
-      </w:r>
-      <w:r>
-        <w:rPr>
-          <w:rFonts w:hint="eastAsia"/>
-        </w:rPr>
-        <w:t>，否则go会给0值到数据库，但如果默认值是NULL那就不要写，因为go默认会给NULL。</w:t>
-      </w:r>
-    </w:p>
-    <w:p>
-      <w:pPr>
-        <w:rPr>
-          <w:rFonts w:hint="eastAsia"/>
-        </w:rPr>
-      </w:pPr>
-    </w:p>
-    <w:p>
-      <w:pPr>
-        <w:rPr>
-          <w:rFonts w:hint="eastAsia"/>
-        </w:rPr>
-      </w:pPr>
-    </w:p>
-    <w:p/>
-    <w:p>
+        <w:t>API的request和response设计准则</w:t>
+      </w:r>
+    </w:p>
+    <w:p>
+      <w:pPr>
+        <w:pStyle w:val="a9"/>
+        <w:numPr>
+          <w:ilvl w:val="1"/>
+          <w:numId w:val="3"/>
+        </w:numPr>
+      </w:pPr>
+      <w:r>
+        <w:rPr>
+          <w:rFonts w:hint="eastAsia"/>
+        </w:rPr>
+        <w:t>每个API需要对应一个Request</w:t>
+      </w:r>
+    </w:p>
+    <w:p>
+      <w:pPr>
+        <w:pStyle w:val="a9"/>
+        <w:numPr>
+          <w:ilvl w:val="1"/>
+          <w:numId w:val="3"/>
+        </w:numPr>
+        <w:rPr>
+          <w:rFonts w:hint="eastAsia"/>
+        </w:rPr>
+      </w:pPr>
+      <w:r>
+        <w:rPr>
+          <w:rFonts w:hint="eastAsia"/>
+        </w:rPr>
+        <w:t>但是多个API可以共享一个response</w:t>
+      </w:r>
+      <w:r>
+        <w:rPr>
+          <w:rFonts w:hint="eastAsia"/>
+        </w:rPr>
+        <w:t>，或者说，response可以按资源来设计</w:t>
+      </w:r>
+    </w:p>
+    <w:p>
+      <w:pPr>
+        <w:rPr>
+          <w:rFonts w:hint="eastAsia"/>
+        </w:rPr>
+      </w:pPr>
+    </w:p>
+    <w:p>
+      <w:pPr>
+        <w:rPr>
+          <w:rFonts w:hint="eastAsia"/>
+        </w:rPr>
+      </w:pPr>
+    </w:p>
+    <w:p>
+      <w:pPr>
+        <w:rPr>
+          <w:rFonts w:hint="eastAsia"/>
+        </w:rPr>
+      </w:pPr>
       <w:r>
         <w:rPr>
           <w:rFonts w:hint="eastAsia"/>
@@ -319,8 +582,19 @@
         <w:t>（最终版）</w:t>
       </w:r>
     </w:p>
-    <w:p/>
-    <w:p>
+    <w:p>
+      <w:pPr>
+        <w:rPr>
+          <w:rFonts w:hint="eastAsia"/>
+        </w:rPr>
+      </w:pPr>
+    </w:p>
+    <w:p>
+      <w:pPr>
+        <w:rPr>
+          <w:rFonts w:hint="eastAsia"/>
+        </w:rPr>
+      </w:pPr>
       <w:r>
         <w:t>DB Model</w:t>
       </w:r>
@@ -343,10 +617,17 @@
         <w:t>Response (API)</w:t>
       </w:r>
     </w:p>
-    <w:p/>
-    <w:p>
-      <w:pPr>
-        <w:rPr>
+    <w:p>
+      <w:pPr>
+        <w:rPr>
+          <w:rFonts w:hint="eastAsia"/>
+        </w:rPr>
+      </w:pPr>
+    </w:p>
+    <w:p>
+      <w:pPr>
+        <w:rPr>
+          <w:rFonts w:hint="eastAsia"/>
           <w:b/>
           <w:bCs/>
         </w:rPr>
@@ -356,95 +637,101 @@
           <w:b/>
           <w:bCs/>
         </w:rPr>
+        <w:lastRenderedPageBreak/>
         <w:t>数据库模型（internal/model）</w:t>
       </w:r>
     </w:p>
     <w:p>
+      <w:pPr>
+        <w:rPr>
+          <w:rFonts w:hint="eastAsia"/>
+        </w:rPr>
+      </w:pPr>
       <w:r>
         <w:t>type User struct {</w:t>
       </w:r>
     </w:p>
     <w:p>
-      <w:r>
-        <w:t xml:space="preserve">    ID                </w:t>
-      </w:r>
-      <w:proofErr w:type="spellStart"/>
-      <w:r>
-        <w:t>uuid.UUID</w:t>
-      </w:r>
-      <w:proofErr w:type="spellEnd"/>
-    </w:p>
-    <w:p>
+      <w:pPr>
+        <w:rPr>
+          <w:rFonts w:hint="eastAsia"/>
+        </w:rPr>
+      </w:pPr>
+      <w:r>
+        <w:t xml:space="preserve">    ID                uuid.UUID</w:t>
+      </w:r>
+    </w:p>
+    <w:p>
+      <w:pPr>
+        <w:rPr>
+          <w:rFonts w:hint="eastAsia"/>
+        </w:rPr>
+      </w:pPr>
       <w:r>
         <w:t xml:space="preserve">    Email             string</w:t>
       </w:r>
     </w:p>
     <w:p>
-      <w:r>
-        <w:t xml:space="preserve">    </w:t>
-      </w:r>
-      <w:proofErr w:type="spellStart"/>
-      <w:r>
-        <w:t>PasswordHash</w:t>
-      </w:r>
-      <w:proofErr w:type="spellEnd"/>
-      <w:r>
-        <w:t xml:space="preserve">      string</w:t>
-      </w:r>
-    </w:p>
-    <w:p>
-      <w:r>
-        <w:t xml:space="preserve">    </w:t>
-      </w:r>
-      <w:proofErr w:type="spellStart"/>
-      <w:r>
-        <w:t>PreferredCurrency</w:t>
-      </w:r>
-      <w:proofErr w:type="spellEnd"/>
-      <w:r>
-        <w:t xml:space="preserve"> string</w:t>
-      </w:r>
-    </w:p>
-    <w:p>
-      <w:r>
-        <w:t xml:space="preserve">    </w:t>
-      </w:r>
-      <w:proofErr w:type="spellStart"/>
-      <w:r>
-        <w:t>CreatedAt</w:t>
-      </w:r>
-      <w:proofErr w:type="spellEnd"/>
-      <w:r>
-        <w:t xml:space="preserve">         </w:t>
-      </w:r>
-      <w:proofErr w:type="spellStart"/>
-      <w:r>
-        <w:t>time.Time</w:t>
-      </w:r>
-      <w:proofErr w:type="spellEnd"/>
-    </w:p>
-    <w:p>
+      <w:pPr>
+        <w:rPr>
+          <w:rFonts w:hint="eastAsia"/>
+        </w:rPr>
+      </w:pPr>
+      <w:r>
+        <w:t xml:space="preserve">    PasswordHash      string</w:t>
+      </w:r>
+    </w:p>
+    <w:p>
+      <w:pPr>
+        <w:rPr>
+          <w:rFonts w:hint="eastAsia"/>
+        </w:rPr>
+      </w:pPr>
+      <w:r>
+        <w:t xml:space="preserve">    PreferredCurrency string</w:t>
+      </w:r>
+    </w:p>
+    <w:p>
+      <w:pPr>
+        <w:rPr>
+          <w:rFonts w:hint="eastAsia"/>
+        </w:rPr>
+      </w:pPr>
+      <w:r>
+        <w:t xml:space="preserve">    CreatedAt         time.Time</w:t>
+      </w:r>
+    </w:p>
+    <w:p>
+      <w:pPr>
+        <w:rPr>
+          <w:rFonts w:hint="eastAsia"/>
+        </w:rPr>
+      </w:pPr>
       <w:r>
         <w:t>}</w:t>
       </w:r>
     </w:p>
     <w:p>
-      <w:r>
-        <w:t xml:space="preserve">不写 </w:t>
-      </w:r>
-      <w:proofErr w:type="spellStart"/>
-      <w:r>
-        <w:t>json</w:t>
-      </w:r>
-      <w:proofErr w:type="spellEnd"/>
-      <w:r>
-        <w:t xml:space="preserve"> tag 也可以。</w:t>
-      </w:r>
-    </w:p>
-    <w:p/>
-    <w:p>
-      <w:pPr>
-        <w:rPr>
+      <w:pPr>
+        <w:rPr>
+          <w:rFonts w:hint="eastAsia"/>
+        </w:rPr>
+      </w:pPr>
+      <w:r>
+        <w:t>不写 json tag 也可以。</w:t>
+      </w:r>
+    </w:p>
+    <w:p>
+      <w:pPr>
+        <w:rPr>
+          <w:rFonts w:hint="eastAsia"/>
+        </w:rPr>
+      </w:pPr>
+    </w:p>
+    <w:p>
+      <w:pPr>
+        <w:rPr>
+          <w:rFonts w:hint="eastAsia"/>
           <w:b/>
           <w:bCs/>
         </w:rPr>
@@ -458,67 +745,66 @@
       </w:r>
     </w:p>
     <w:p>
-      <w:r>
-        <w:t xml:space="preserve">type </w:t>
-      </w:r>
-      <w:proofErr w:type="spellStart"/>
-      <w:r>
-        <w:t>RegisterRequest</w:t>
-      </w:r>
-      <w:proofErr w:type="spellEnd"/>
-      <w:r>
-        <w:t xml:space="preserve"> struct {</w:t>
-      </w:r>
-    </w:p>
-    <w:p>
-      <w:r>
-        <w:t xml:space="preserve">    Email    string `</w:t>
-      </w:r>
-      <w:proofErr w:type="spellStart"/>
-      <w:r>
-        <w:t>json</w:t>
-      </w:r>
-      <w:proofErr w:type="spellEnd"/>
-      <w:r>
-        <w:t>:"email"`</w:t>
-      </w:r>
-    </w:p>
-    <w:p>
-      <w:r>
-        <w:t xml:space="preserve">    Password string `</w:t>
-      </w:r>
-      <w:proofErr w:type="spellStart"/>
-      <w:r>
-        <w:t>json</w:t>
-      </w:r>
-      <w:proofErr w:type="spellEnd"/>
-      <w:r>
-        <w:t>:"password"`</w:t>
-      </w:r>
-    </w:p>
-    <w:p>
-      <w:r>
-        <w:lastRenderedPageBreak/>
-        <w:t xml:space="preserve">    Name     string `</w:t>
-      </w:r>
-      <w:proofErr w:type="spellStart"/>
-      <w:r>
-        <w:t>json</w:t>
-      </w:r>
-      <w:proofErr w:type="spellEnd"/>
-      <w:r>
-        <w:t>:"name"`</w:t>
-      </w:r>
-    </w:p>
-    <w:p>
+      <w:pPr>
+        <w:rPr>
+          <w:rFonts w:hint="eastAsia"/>
+        </w:rPr>
+      </w:pPr>
+      <w:r>
+        <w:t>type RegisterRequest struct {</w:t>
+      </w:r>
+    </w:p>
+    <w:p>
+      <w:pPr>
+        <w:rPr>
+          <w:rFonts w:hint="eastAsia"/>
+        </w:rPr>
+      </w:pPr>
+      <w:r>
+        <w:t xml:space="preserve">    Email    string `json:"email"`</w:t>
+      </w:r>
+    </w:p>
+    <w:p>
+      <w:pPr>
+        <w:rPr>
+          <w:rFonts w:hint="eastAsia"/>
+        </w:rPr>
+      </w:pPr>
+      <w:r>
+        <w:t xml:space="preserve">    Password string `json:"password"`</w:t>
+      </w:r>
+    </w:p>
+    <w:p>
+      <w:pPr>
+        <w:rPr>
+          <w:rFonts w:hint="eastAsia"/>
+        </w:rPr>
+      </w:pPr>
+      <w:r>
+        <w:t xml:space="preserve">    Name     string `json:"name"`</w:t>
+      </w:r>
+    </w:p>
+    <w:p>
+      <w:pPr>
+        <w:rPr>
+          <w:rFonts w:hint="eastAsia"/>
+        </w:rPr>
+      </w:pPr>
       <w:r>
         <w:t>}</w:t>
       </w:r>
     </w:p>
-    <w:p/>
-    <w:p>
-      <w:pPr>
-        <w:rPr>
+    <w:p>
+      <w:pPr>
+        <w:rPr>
+          <w:rFonts w:hint="eastAsia"/>
+        </w:rPr>
+      </w:pPr>
+    </w:p>
+    <w:p>
+      <w:pPr>
+        <w:rPr>
+          <w:rFonts w:hint="eastAsia"/>
           <w:b/>
           <w:bCs/>
         </w:rPr>
@@ -532,132 +818,71 @@
       </w:r>
     </w:p>
     <w:p>
-      <w:r>
-        <w:t xml:space="preserve">type </w:t>
-      </w:r>
-      <w:proofErr w:type="spellStart"/>
-      <w:r>
-        <w:t>UserResponse</w:t>
-      </w:r>
-      <w:proofErr w:type="spellEnd"/>
-      <w:r>
-        <w:t xml:space="preserve"> struct {</w:t>
-      </w:r>
-    </w:p>
-    <w:p>
-      <w:r>
-        <w:t xml:space="preserve">    ID                </w:t>
-      </w:r>
-      <w:proofErr w:type="spellStart"/>
-      <w:r>
-        <w:t>uuid.UUID</w:t>
-      </w:r>
-      <w:proofErr w:type="spellEnd"/>
-      <w:r>
-        <w:t xml:space="preserve"> `</w:t>
-      </w:r>
-      <w:proofErr w:type="spellStart"/>
-      <w:r>
-        <w:t>json</w:t>
-      </w:r>
-      <w:proofErr w:type="spellEnd"/>
-      <w:r>
-        <w:t>:"id"`</w:t>
-      </w:r>
-    </w:p>
-    <w:p>
-      <w:r>
-        <w:t xml:space="preserve">    Email             string    `</w:t>
-      </w:r>
-      <w:proofErr w:type="spellStart"/>
-      <w:r>
-        <w:t>json</w:t>
-      </w:r>
-      <w:proofErr w:type="spellEnd"/>
-      <w:r>
-        <w:t>:"email"`</w:t>
-      </w:r>
-    </w:p>
-    <w:p>
-      <w:r>
-        <w:t xml:space="preserve">    Name              string    `</w:t>
-      </w:r>
-      <w:proofErr w:type="spellStart"/>
-      <w:r>
-        <w:t>json</w:t>
-      </w:r>
-      <w:proofErr w:type="spellEnd"/>
-      <w:r>
-        <w:t>:"name"`</w:t>
-      </w:r>
-    </w:p>
-    <w:p>
-      <w:r>
-        <w:t xml:space="preserve">    </w:t>
-      </w:r>
-      <w:proofErr w:type="spellStart"/>
-      <w:r>
-        <w:t>PreferredCurrency</w:t>
-      </w:r>
-      <w:proofErr w:type="spellEnd"/>
-      <w:r>
-        <w:t xml:space="preserve"> string    `</w:t>
-      </w:r>
-      <w:proofErr w:type="spellStart"/>
-      <w:r>
-        <w:t>json</w:t>
-      </w:r>
-      <w:proofErr w:type="spellEnd"/>
-      <w:r>
-        <w:t>:"</w:t>
-      </w:r>
-      <w:proofErr w:type="spellStart"/>
-      <w:r>
-        <w:t>preferred_currency</w:t>
-      </w:r>
-      <w:proofErr w:type="spellEnd"/>
-      <w:r>
-        <w:t>"`</w:t>
-      </w:r>
-    </w:p>
-    <w:p>
-      <w:r>
-        <w:t xml:space="preserve">    </w:t>
-      </w:r>
-      <w:proofErr w:type="spellStart"/>
-      <w:r>
-        <w:t>CreatedAt</w:t>
-      </w:r>
-      <w:proofErr w:type="spellEnd"/>
-      <w:r>
-        <w:t xml:space="preserve">         </w:t>
-      </w:r>
-      <w:proofErr w:type="spellStart"/>
-      <w:r>
-        <w:t>time.Time</w:t>
-      </w:r>
-      <w:proofErr w:type="spellEnd"/>
-      <w:r>
-        <w:t xml:space="preserve"> `</w:t>
-      </w:r>
-      <w:proofErr w:type="spellStart"/>
-      <w:r>
-        <w:t>json</w:t>
-      </w:r>
-      <w:proofErr w:type="spellEnd"/>
-      <w:r>
-        <w:t>:"</w:t>
-      </w:r>
-      <w:proofErr w:type="spellStart"/>
-      <w:r>
-        <w:t>created_at</w:t>
-      </w:r>
-      <w:proofErr w:type="spellEnd"/>
-      <w:r>
-        <w:t>"`</w:t>
-      </w:r>
-    </w:p>
-    <w:p>
+      <w:pPr>
+        <w:rPr>
+          <w:rFonts w:hint="eastAsia"/>
+        </w:rPr>
+      </w:pPr>
+      <w:r>
+        <w:t>type UserResponse struct {</w:t>
+      </w:r>
+    </w:p>
+    <w:p>
+      <w:pPr>
+        <w:rPr>
+          <w:rFonts w:hint="eastAsia"/>
+        </w:rPr>
+      </w:pPr>
+      <w:r>
+        <w:t xml:space="preserve">    ID                uuid.UUID `json:"id"`</w:t>
+      </w:r>
+    </w:p>
+    <w:p>
+      <w:pPr>
+        <w:rPr>
+          <w:rFonts w:hint="eastAsia"/>
+        </w:rPr>
+      </w:pPr>
+      <w:r>
+        <w:t xml:space="preserve">    Email             string    `json:"email"`</w:t>
+      </w:r>
+    </w:p>
+    <w:p>
+      <w:pPr>
+        <w:rPr>
+          <w:rFonts w:hint="eastAsia"/>
+        </w:rPr>
+      </w:pPr>
+      <w:r>
+        <w:t xml:space="preserve">    Name              string    `json:"name"`</w:t>
+      </w:r>
+    </w:p>
+    <w:p>
+      <w:pPr>
+        <w:rPr>
+          <w:rFonts w:hint="eastAsia"/>
+        </w:rPr>
+      </w:pPr>
+      <w:r>
+        <w:t xml:space="preserve">    PreferredCurrency string    `json:"preferred_currency"`</w:t>
+      </w:r>
+    </w:p>
+    <w:p>
+      <w:pPr>
+        <w:rPr>
+          <w:rFonts w:hint="eastAsia"/>
+        </w:rPr>
+      </w:pPr>
+      <w:r>
+        <w:t xml:space="preserve">    CreatedAt         time.Time `json:"created_at"`</w:t>
+      </w:r>
+    </w:p>
+    <w:p>
+      <w:pPr>
+        <w:rPr>
+          <w:rFonts w:hint="eastAsia"/>
+        </w:rPr>
+      </w:pPr>
       <w:r>
         <w:t>}</w:t>
       </w:r>
@@ -693,9 +918,27 @@
         <w:t>模块功能定义</w:t>
       </w:r>
     </w:p>
-    <w:p/>
-    <w:p/>
-    <w:p/>
+    <w:p>
+      <w:pPr>
+        <w:rPr>
+          <w:rFonts w:hint="eastAsia"/>
+        </w:rPr>
+      </w:pPr>
+    </w:p>
+    <w:p>
+      <w:pPr>
+        <w:rPr>
+          <w:rFonts w:hint="eastAsia"/>
+        </w:rPr>
+      </w:pPr>
+    </w:p>
+    <w:p>
+      <w:pPr>
+        <w:rPr>
+          <w:rFonts w:hint="eastAsia"/>
+        </w:rPr>
+      </w:pPr>
+    </w:p>
     <w:p>
       <w:pPr>
         <w:rPr>
@@ -1015,9 +1258,158 @@
     </w:lvl>
   </w:abstractNum>
   <w:abstractNum w:abstractNumId="2" w15:restartNumberingAfterBreak="0">
+    <w:nsid w:val="660522B8"/>
+    <w:multiLevelType w:val="multilevel"/>
+    <w:tmpl w:val="5F500944"/>
+    <w:lvl w:ilvl="0">
+      <w:start w:val="1"/>
+      <w:numFmt w:val="bullet"/>
+      <w:lvlText w:val=""/>
+      <w:lvlJc w:val="left"/>
+      <w:pPr>
+        <w:tabs>
+          <w:tab w:val="num" w:pos="720"/>
+        </w:tabs>
+        <w:ind w:left="720" w:hanging="360"/>
+      </w:pPr>
+      <w:rPr>
+        <w:rFonts w:ascii="Symbol" w:hAnsi="Symbol" w:hint="default"/>
+        <w:sz w:val="20"/>
+      </w:rPr>
+    </w:lvl>
+    <w:lvl w:ilvl="1" w:tentative="1">
+      <w:start w:val="1"/>
+      <w:numFmt w:val="bullet"/>
+      <w:lvlText w:val="o"/>
+      <w:lvlJc w:val="left"/>
+      <w:pPr>
+        <w:tabs>
+          <w:tab w:val="num" w:pos="1440"/>
+        </w:tabs>
+        <w:ind w:left="1440" w:hanging="360"/>
+      </w:pPr>
+      <w:rPr>
+        <w:rFonts w:ascii="Courier New" w:hAnsi="Courier New" w:hint="default"/>
+        <w:sz w:val="20"/>
+      </w:rPr>
+    </w:lvl>
+    <w:lvl w:ilvl="2" w:tentative="1">
+      <w:start w:val="1"/>
+      <w:numFmt w:val="bullet"/>
+      <w:lvlText w:val=""/>
+      <w:lvlJc w:val="left"/>
+      <w:pPr>
+        <w:tabs>
+          <w:tab w:val="num" w:pos="2160"/>
+        </w:tabs>
+        <w:ind w:left="2160" w:hanging="360"/>
+      </w:pPr>
+      <w:rPr>
+        <w:rFonts w:ascii="Wingdings" w:hAnsi="Wingdings" w:hint="default"/>
+        <w:sz w:val="20"/>
+      </w:rPr>
+    </w:lvl>
+    <w:lvl w:ilvl="3" w:tentative="1">
+      <w:start w:val="1"/>
+      <w:numFmt w:val="bullet"/>
+      <w:lvlText w:val=""/>
+      <w:lvlJc w:val="left"/>
+      <w:pPr>
+        <w:tabs>
+          <w:tab w:val="num" w:pos="2880"/>
+        </w:tabs>
+        <w:ind w:left="2880" w:hanging="360"/>
+      </w:pPr>
+      <w:rPr>
+        <w:rFonts w:ascii="Wingdings" w:hAnsi="Wingdings" w:hint="default"/>
+        <w:sz w:val="20"/>
+      </w:rPr>
+    </w:lvl>
+    <w:lvl w:ilvl="4" w:tentative="1">
+      <w:start w:val="1"/>
+      <w:numFmt w:val="bullet"/>
+      <w:lvlText w:val=""/>
+      <w:lvlJc w:val="left"/>
+      <w:pPr>
+        <w:tabs>
+          <w:tab w:val="num" w:pos="3600"/>
+        </w:tabs>
+        <w:ind w:left="3600" w:hanging="360"/>
+      </w:pPr>
+      <w:rPr>
+        <w:rFonts w:ascii="Wingdings" w:hAnsi="Wingdings" w:hint="default"/>
+        <w:sz w:val="20"/>
+      </w:rPr>
+    </w:lvl>
+    <w:lvl w:ilvl="5" w:tentative="1">
+      <w:start w:val="1"/>
+      <w:numFmt w:val="bullet"/>
+      <w:lvlText w:val=""/>
+      <w:lvlJc w:val="left"/>
+      <w:pPr>
+        <w:tabs>
+          <w:tab w:val="num" w:pos="4320"/>
+        </w:tabs>
+        <w:ind w:left="4320" w:hanging="360"/>
+      </w:pPr>
+      <w:rPr>
+        <w:rFonts w:ascii="Wingdings" w:hAnsi="Wingdings" w:hint="default"/>
+        <w:sz w:val="20"/>
+      </w:rPr>
+    </w:lvl>
+    <w:lvl w:ilvl="6" w:tentative="1">
+      <w:start w:val="1"/>
+      <w:numFmt w:val="bullet"/>
+      <w:lvlText w:val=""/>
+      <w:lvlJc w:val="left"/>
+      <w:pPr>
+        <w:tabs>
+          <w:tab w:val="num" w:pos="5040"/>
+        </w:tabs>
+        <w:ind w:left="5040" w:hanging="360"/>
+      </w:pPr>
+      <w:rPr>
+        <w:rFonts w:ascii="Wingdings" w:hAnsi="Wingdings" w:hint="default"/>
+        <w:sz w:val="20"/>
+      </w:rPr>
+    </w:lvl>
+    <w:lvl w:ilvl="7" w:tentative="1">
+      <w:start w:val="1"/>
+      <w:numFmt w:val="bullet"/>
+      <w:lvlText w:val=""/>
+      <w:lvlJc w:val="left"/>
+      <w:pPr>
+        <w:tabs>
+          <w:tab w:val="num" w:pos="5760"/>
+        </w:tabs>
+        <w:ind w:left="5760" w:hanging="360"/>
+      </w:pPr>
+      <w:rPr>
+        <w:rFonts w:ascii="Wingdings" w:hAnsi="Wingdings" w:hint="default"/>
+        <w:sz w:val="20"/>
+      </w:rPr>
+    </w:lvl>
+    <w:lvl w:ilvl="8" w:tentative="1">
+      <w:start w:val="1"/>
+      <w:numFmt w:val="bullet"/>
+      <w:lvlText w:val=""/>
+      <w:lvlJc w:val="left"/>
+      <w:pPr>
+        <w:tabs>
+          <w:tab w:val="num" w:pos="6480"/>
+        </w:tabs>
+        <w:ind w:left="6480" w:hanging="360"/>
+      </w:pPr>
+      <w:rPr>
+        <w:rFonts w:ascii="Wingdings" w:hAnsi="Wingdings" w:hint="default"/>
+        <w:sz w:val="20"/>
+      </w:rPr>
+    </w:lvl>
+  </w:abstractNum>
+  <w:abstractNum w:abstractNumId="3" w15:restartNumberingAfterBreak="0">
     <w:nsid w:val="76FE4D7D"/>
     <w:multiLevelType w:val="hybridMultilevel"/>
-    <w:tmpl w:val="EC9A827C"/>
+    <w:tmpl w:val="3390AD20"/>
     <w:lvl w:ilvl="0" w:tplc="04090001">
       <w:start w:val="1"/>
       <w:numFmt w:val="bullet"/>
@@ -1030,7 +1422,7 @@
         <w:rFonts w:ascii="Wingdings" w:hAnsi="Wingdings" w:hint="default"/>
       </w:rPr>
     </w:lvl>
-    <w:lvl w:ilvl="1" w:tplc="04090003" w:tentative="1">
+    <w:lvl w:ilvl="1" w:tplc="04090003">
       <w:start w:val="1"/>
       <w:numFmt w:val="bullet"/>
       <w:lvlText w:val=""/>
@@ -1134,6 +1526,9 @@
     <w:abstractNumId w:val="0"/>
   </w:num>
   <w:num w:numId="3" w16cid:durableId="1502157214">
+    <w:abstractNumId w:val="3"/>
+  </w:num>
+  <w:num w:numId="4" w16cid:durableId="1899432783">
     <w:abstractNumId w:val="2"/>
   </w:num>
 </w:numbering>

</xml_diff>